<commit_message>
Community: playbook track 1 is text only
Co-Authored-By: Claude Fable 5.1 <noreply@anthropic.com>
Claude-Session: https://claude.ai/code/session_011JsCTTjCbUkHbTuWTKQSXJ
</commit_message>
<xml_diff>
--- a/marketing/community/strive-elite-groupme-playbook.docx
+++ b/marketing/community/strive-elite-groupme-playbook.docx
@@ -58,6 +58,19 @@
           <w:szCs w:val="22"/>
         </w:rPr>
         <w:t xml:space="preserve">The frame: a small group of the guys who take it seriously. Chosen, not recruited.</w:t>
+      </w:r>
+    </w:p>
+    <w:p>
+      <w:pPr>
+        <w:spacing w:after="120"/>
+      </w:pPr>
+      <w:r>
+        <w:rPr>
+          <w:rFonts w:ascii="Arial" w:cs="Arial" w:eastAsia="Arial" w:hAnsi="Arial"/>
+          <w:sz w:val="22"/>
+          <w:szCs w:val="22"/>
+        </w:rPr>
+        <w:t xml:space="preserve">All over text. No in-person step.</w:t>
       </w:r>
     </w:p>
     <w:p>
@@ -75,7 +88,7 @@
           <w:sz w:val="22"/>
           <w:szCs w:val="22"/>
         </w:rPr>
-        <w:t xml:space="preserve">At pickup, in person, one line, by name:</w:t>
+        <w:t xml:space="preserve">Text 1, by name, no link:</w:t>
       </w:r>
     </w:p>
     <w:p>
@@ -91,7 +104,7 @@
           <w:sz w:val="22"/>
           <w:szCs w:val="22"/>
         </w:rPr>
-        <w:t xml:space="preserve">"I'm putting together a small group of the guys who actually take this seriously. You're on it. I'll text you tonight."</w:t>
+        <w:t xml:space="preserve">"[First], putting together a small group of the guys from pickup who actually take this seriously. You're on it. Strive Elite. Wins, motivation, and you hear about events first. Good if I add you?"</w:t>
       </w:r>
     </w:p>
     <w:p>
@@ -109,23 +122,7 @@
           <w:sz w:val="22"/>
           <w:szCs w:val="22"/>
         </w:rPr>
-        <w:t xml:space="preserve">That night, one text, no link:</w:t>
-      </w:r>
-    </w:p>
-    <w:p>
-      <w:pPr>
-        <w:spacing w:after="120"/>
-        <w:ind w:left="480"/>
-      </w:pPr>
-      <w:r>
-        <w:rPr>
-          <w:rFonts w:ascii="Arial" w:cs="Arial" w:eastAsia="Arial" w:hAnsi="Arial"/>
-          <w:i/>
-          <w:iCs/>
-          <w:sz w:val="22"/>
-          <w:szCs w:val="22"/>
-        </w:rPr>
-        <w:t xml:space="preserve">"[First], the group I mentioned. Strive Elite. Wins, motivation, and you hear about events first. Adding you now, you'll get a GroupMe text."</w:t>
+        <w:t xml:space="preserve">On his yes, add him. In the group, one line: "[First] is in."</w:t>
       </w:r>
     </w:p>
     <w:p>
@@ -143,7 +140,36 @@
           <w:sz w:val="22"/>
           <w:szCs w:val="22"/>
         </w:rPr>
-        <w:t xml:space="preserve">Add him. In the group, one line: "[First] is in."</w:t>
+        <w:t xml:space="preserve">Text 2, within 24 hours, private, hand him his first post:</w:t>
+      </w:r>
+    </w:p>
+    <w:p>
+      <w:pPr>
+        <w:spacing w:after="120"/>
+        <w:ind w:left="480"/>
+      </w:pPr>
+      <w:r>
+        <w:rPr>
+          <w:rFonts w:ascii="Arial" w:cs="Arial" w:eastAsia="Arial" w:hAnsi="Arial"/>
+          <w:i/>
+          <w:iCs/>
+          <w:sz w:val="22"/>
+          <w:szCs w:val="22"/>
+        </w:rPr>
+        <w:t xml:space="preserve">"Post that [goal / move from last pickup] in the group. Let's see it."</w:t>
+      </w:r>
+    </w:p>
+    <w:p>
+      <w:pPr>
+        <w:spacing w:after="120"/>
+      </w:pPr>
+      <w:r>
+        <w:rPr>
+          <w:rFonts w:ascii="Arial" w:cs="Arial" w:eastAsia="Arial" w:hAnsi="Arial"/>
+          <w:sz w:val="22"/>
+          <w:szCs w:val="22"/>
+        </w:rPr>
+        <w:t xml:space="preserve">He posts because you told him what to post, not because he decided to.</w:t>
       </w:r>
     </w:p>
     <w:p>
@@ -161,36 +187,7 @@
           <w:sz w:val="22"/>
           <w:szCs w:val="22"/>
         </w:rPr>
-        <w:t xml:space="preserve">Within 24 hours, hand him his first post. Text him privately:</w:t>
-      </w:r>
-    </w:p>
-    <w:p>
-      <w:pPr>
-        <w:spacing w:after="120"/>
-        <w:ind w:left="480"/>
-      </w:pPr>
-      <w:r>
-        <w:rPr>
-          <w:rFonts w:ascii="Arial" w:cs="Arial" w:eastAsia="Arial" w:hAnsi="Arial"/>
-          <w:i/>
-          <w:iCs/>
-          <w:sz w:val="22"/>
-          <w:szCs w:val="22"/>
-        </w:rPr>
-        <w:t xml:space="preserve">"Post that [goal / move / win from pickup] in the group."</w:t>
-      </w:r>
-    </w:p>
-    <w:p>
-      <w:pPr>
-        <w:spacing w:after="120"/>
-      </w:pPr>
-      <w:r>
-        <w:rPr>
-          <w:rFonts w:ascii="Arial" w:cs="Arial" w:eastAsia="Arial" w:hAnsi="Arial"/>
-          <w:sz w:val="22"/>
-          <w:szCs w:val="22"/>
-        </w:rPr>
-        <w:t xml:space="preserve">He posts because you told him what to post, not because he decided to.</w:t>
+        <w:t xml:space="preserve">No reply to text 1 means nothing more. No follow-up, no link. The guys who answer are the group.</w:t>
       </w:r>
     </w:p>
     <w:p>

</xml_diff>

<commit_message>
Community: playbook cut to the texts only
Co-Authored-By: Claude Fable 5.1 <noreply@anthropic.com>
Claude-Session: https://claude.ai/code/session_011JsCTTjCbUkHbTuWTKQSXJ
</commit_message>
<xml_diff>
--- a/marketing/community/strive-elite-groupme-playbook.docx
+++ b/marketing/community/strive-elite-groupme-playbook.docx
@@ -5,36 +5,38 @@
     <w:p>
       <w:pPr>
         <w:pStyle w:val="Heading1"/>
-        <w:spacing w:after="120" w:before="240"/>
+        <w:spacing w:after="160"/>
       </w:pPr>
       <w:r>
         <w:rPr>
           <w:rFonts w:ascii="Arial" w:cs="Arial" w:eastAsia="Arial" w:hAnsi="Arial"/>
           <w:b/>
           <w:bCs/>
-          <w:sz w:val="30"/>
-          <w:szCs w:val="30"/>
-        </w:rPr>
-        <w:t xml:space="preserve">Strive Elite GroupMe: getting the right people in</w:t>
-      </w:r>
-    </w:p>
-    <w:p>
-      <w:pPr>
-        <w:spacing w:after="120"/>
-      </w:pPr>
-      <w:r>
-        <w:rPr>
-          <w:rFonts w:ascii="Arial" w:cs="Arial" w:eastAsia="Arial" w:hAnsi="Arial"/>
-          <w:sz w:val="22"/>
-          <w:szCs w:val="22"/>
-        </w:rPr>
-        <w:t xml:space="preserve">Two tracks. One rule over both: nobody gets a link. They get invited, by name, by you. Three invites a day, max.</w:t>
+          <w:sz w:val="32"/>
+          <w:szCs w:val="32"/>
+        </w:rPr>
+        <w:t xml:space="preserve">Strive Elite GroupMe</w:t>
+      </w:r>
+    </w:p>
+    <w:p>
+      <w:pPr>
+        <w:spacing w:after="140"/>
+      </w:pPr>
+      <w:r>
+        <w:rPr>
+          <w:rFonts w:ascii="Arial" w:cs="Arial" w:eastAsia="Arial" w:hAnsi="Arial"/>
+          <w:b/>
+          <w:bCs/>
+          <w:sz w:val="22"/>
+          <w:szCs w:val="22"/>
+        </w:rPr>
+        <w:t xml:space="preserve">No links. Text by name. Three a day.</w:t>
       </w:r>
     </w:p>
     <w:p>
       <w:pPr>
         <w:pStyle w:val="Heading2"/>
-        <w:spacing w:after="100" w:before="280"/>
+        <w:spacing w:after="120" w:before="320"/>
       </w:pPr>
       <w:r>
         <w:rPr>
@@ -44,56 +46,27 @@
           <w:sz w:val="26"/>
           <w:szCs w:val="26"/>
         </w:rPr>
-        <w:t xml:space="preserve">Track 1: pickup players (high school, high level)</w:t>
-      </w:r>
-    </w:p>
-    <w:p>
-      <w:pPr>
-        <w:spacing w:after="120"/>
-      </w:pPr>
-      <w:r>
-        <w:rPr>
-          <w:rFonts w:ascii="Arial" w:cs="Arial" w:eastAsia="Arial" w:hAnsi="Arial"/>
-          <w:sz w:val="22"/>
-          <w:szCs w:val="22"/>
-        </w:rPr>
-        <w:t xml:space="preserve">The frame: a small group of the guys who take it seriously. Chosen, not recruited.</w:t>
-      </w:r>
-    </w:p>
-    <w:p>
-      <w:pPr>
-        <w:spacing w:after="120"/>
-      </w:pPr>
-      <w:r>
-        <w:rPr>
-          <w:rFonts w:ascii="Arial" w:cs="Arial" w:eastAsia="Arial" w:hAnsi="Arial"/>
-          <w:sz w:val="22"/>
-          <w:szCs w:val="22"/>
-        </w:rPr>
-        <w:t xml:space="preserve">All over text. No in-person step.</w:t>
-      </w:r>
-    </w:p>
-    <w:p>
-      <w:pPr>
-        <w:pStyle w:val="ListParagraph"/>
-        <w:numPr>
-          <w:ilvl w:val="0"/>
-          <w:numId w:val="2"/>
-        </w:numPr>
-        <w:spacing w:after="80"/>
-      </w:pPr>
-      <w:r>
-        <w:rPr>
-          <w:rFonts w:ascii="Arial" w:cs="Arial" w:eastAsia="Arial" w:hAnsi="Arial"/>
-          <w:sz w:val="22"/>
-          <w:szCs w:val="22"/>
-        </w:rPr>
-        <w:t xml:space="preserve">Text 1, by name, no link:</w:t>
-      </w:r>
-    </w:p>
-    <w:p>
-      <w:pPr>
-        <w:spacing w:after="120"/>
+        <w:t xml:space="preserve">Pickup players</w:t>
+      </w:r>
+    </w:p>
+    <w:p>
+      <w:pPr>
+        <w:spacing w:after="140"/>
+      </w:pPr>
+      <w:r>
+        <w:rPr>
+          <w:rFonts w:ascii="Arial" w:cs="Arial" w:eastAsia="Arial" w:hAnsi="Arial"/>
+          <w:b w:val="false"/>
+          <w:bCs w:val="false"/>
+          <w:sz w:val="22"/>
+          <w:szCs w:val="22"/>
+        </w:rPr>
+        <w:t xml:space="preserve">Text 1:</w:t>
+      </w:r>
+    </w:p>
+    <w:p>
+      <w:pPr>
+        <w:spacing w:after="140"/>
         <w:ind w:left="480"/>
       </w:pPr>
       <w:r>
@@ -104,48 +77,42 @@
           <w:sz w:val="22"/>
           <w:szCs w:val="22"/>
         </w:rPr>
-        <w:t xml:space="preserve">"[First], putting together a small group of the guys from pickup who actually take this seriously. You're on it. Strive Elite. Wins, motivation, and you hear about events first. Good if I add you?"</w:t>
-      </w:r>
-    </w:p>
-    <w:p>
-      <w:pPr>
-        <w:pStyle w:val="ListParagraph"/>
-        <w:numPr>
-          <w:ilvl w:val="0"/>
-          <w:numId w:val="2"/>
-        </w:numPr>
-        <w:spacing w:after="80"/>
-      </w:pPr>
-      <w:r>
-        <w:rPr>
-          <w:rFonts w:ascii="Arial" w:cs="Arial" w:eastAsia="Arial" w:hAnsi="Arial"/>
-          <w:sz w:val="22"/>
-          <w:szCs w:val="22"/>
-        </w:rPr>
-        <w:t xml:space="preserve">On his yes, add him. In the group, one line: "[First] is in."</w:t>
-      </w:r>
-    </w:p>
-    <w:p>
-      <w:pPr>
-        <w:pStyle w:val="ListParagraph"/>
-        <w:numPr>
-          <w:ilvl w:val="0"/>
-          <w:numId w:val="2"/>
-        </w:numPr>
-        <w:spacing w:after="80"/>
-      </w:pPr>
-      <w:r>
-        <w:rPr>
-          <w:rFonts w:ascii="Arial" w:cs="Arial" w:eastAsia="Arial" w:hAnsi="Arial"/>
-          <w:sz w:val="22"/>
-          <w:szCs w:val="22"/>
-        </w:rPr>
-        <w:t xml:space="preserve">Text 2, within 24 hours, private, hand him his first post:</w:t>
-      </w:r>
-    </w:p>
-    <w:p>
-      <w:pPr>
-        <w:spacing w:after="120"/>
+        <w:t xml:space="preserve">"[First], putting together a small group of the guys from pickup who actually take this seriously. You're on it. Strive Elite. Wins, motivation, events first. Good if I add you?"</w:t>
+      </w:r>
+    </w:p>
+    <w:p>
+      <w:pPr>
+        <w:spacing w:after="140"/>
+      </w:pPr>
+      <w:r>
+        <w:rPr>
+          <w:rFonts w:ascii="Arial" w:cs="Arial" w:eastAsia="Arial" w:hAnsi="Arial"/>
+          <w:b w:val="false"/>
+          <w:bCs w:val="false"/>
+          <w:sz w:val="22"/>
+          <w:szCs w:val="22"/>
+        </w:rPr>
+        <w:t xml:space="preserve">Yes = add him. In the group: "[First] is in."</w:t>
+      </w:r>
+    </w:p>
+    <w:p>
+      <w:pPr>
+        <w:spacing w:after="140"/>
+      </w:pPr>
+      <w:r>
+        <w:rPr>
+          <w:rFonts w:ascii="Arial" w:cs="Arial" w:eastAsia="Arial" w:hAnsi="Arial"/>
+          <w:b w:val="false"/>
+          <w:bCs w:val="false"/>
+          <w:sz w:val="22"/>
+          <w:szCs w:val="22"/>
+        </w:rPr>
+        <w:t xml:space="preserve">Text 2, next day:</w:t>
+      </w:r>
+    </w:p>
+    <w:p>
+      <w:pPr>
+        <w:spacing w:after="140"/>
         <w:ind w:left="480"/>
       </w:pPr>
       <w:r>
@@ -156,63 +123,28 @@
           <w:sz w:val="22"/>
           <w:szCs w:val="22"/>
         </w:rPr>
-        <w:t xml:space="preserve">"Post that [goal / move from last pickup] in the group. Let's see it."</w:t>
-      </w:r>
-    </w:p>
-    <w:p>
-      <w:pPr>
-        <w:spacing w:after="120"/>
-      </w:pPr>
-      <w:r>
-        <w:rPr>
-          <w:rFonts w:ascii="Arial" w:cs="Arial" w:eastAsia="Arial" w:hAnsi="Arial"/>
-          <w:sz w:val="22"/>
-          <w:szCs w:val="22"/>
-        </w:rPr>
-        <w:t xml:space="preserve">He posts because you told him what to post, not because he decided to.</w:t>
-      </w:r>
-    </w:p>
-    <w:p>
-      <w:pPr>
-        <w:pStyle w:val="ListParagraph"/>
-        <w:numPr>
-          <w:ilvl w:val="0"/>
-          <w:numId w:val="2"/>
-        </w:numPr>
-        <w:spacing w:after="80"/>
-      </w:pPr>
-      <w:r>
-        <w:rPr>
-          <w:rFonts w:ascii="Arial" w:cs="Arial" w:eastAsia="Arial" w:hAnsi="Arial"/>
-          <w:sz w:val="22"/>
-          <w:szCs w:val="22"/>
-        </w:rPr>
-        <w:t xml:space="preserve">No reply to text 1 means nothing more. No follow-up, no link. The guys who answer are the group.</w:t>
-      </w:r>
-    </w:p>
-    <w:p>
-      <w:pPr>
-        <w:spacing w:after="120"/>
-        <w:rPr>
-          <w:b/>
-          <w:bCs/>
-        </w:rPr>
-      </w:pPr>
-      <w:r>
-        <w:rPr>
-          <w:rFonts w:ascii="Arial" w:cs="Arial" w:eastAsia="Arial" w:hAnsi="Arial"/>
-          <w:b/>
-          <w:bCs/>
-          <w:sz w:val="22"/>
-          <w:szCs w:val="22"/>
-        </w:rPr>
-        <w:t xml:space="preserve">Never say: community, join, link, check it out, let me know if you're interested. Never one text to several of them at once.</w:t>
+        <w:t xml:space="preserve">"Post that [goal / move from last pickup] in the group."</w:t>
+      </w:r>
+    </w:p>
+    <w:p>
+      <w:pPr>
+        <w:spacing w:after="140"/>
+      </w:pPr>
+      <w:r>
+        <w:rPr>
+          <w:rFonts w:ascii="Arial" w:cs="Arial" w:eastAsia="Arial" w:hAnsi="Arial"/>
+          <w:b w:val="false"/>
+          <w:bCs w:val="false"/>
+          <w:sz w:val="22"/>
+          <w:szCs w:val="22"/>
+        </w:rPr>
+        <w:t xml:space="preserve">No reply = leave it.</w:t>
       </w:r>
     </w:p>
     <w:p>
       <w:pPr>
         <w:pStyle w:val="Heading2"/>
-        <w:spacing w:after="100" w:before="280"/>
+        <w:spacing w:after="120" w:before="320"/>
       </w:pPr>
       <w:r>
         <w:rPr>
@@ -222,43 +154,27 @@
           <w:sz w:val="26"/>
           <w:szCs w:val="26"/>
         </w:rPr>
-        <w:t xml:space="preserve">Track 2: parents and old clients (younger players)</w:t>
-      </w:r>
-    </w:p>
-    <w:p>
-      <w:pPr>
-        <w:spacing w:after="120"/>
-      </w:pPr>
-      <w:r>
-        <w:rPr>
-          <w:rFonts w:ascii="Arial" w:cs="Arial" w:eastAsia="Arial" w:hAnsi="Arial"/>
-          <w:sz w:val="22"/>
-          <w:szCs w:val="22"/>
-        </w:rPr>
-        <w:t xml:space="preserve">The frame: our most ambitious players and their families, and I want your player around them.</w:t>
-      </w:r>
-    </w:p>
-    <w:p>
-      <w:pPr>
-        <w:pStyle w:val="ListParagraph"/>
-        <w:numPr>
-          <w:ilvl w:val="0"/>
-          <w:numId w:val="3"/>
-        </w:numPr>
-        <w:spacing w:after="80"/>
-      </w:pPr>
-      <w:r>
-        <w:rPr>
-          <w:rFonts w:ascii="Arial" w:cs="Arial" w:eastAsia="Arial" w:hAnsi="Arial"/>
-          <w:sz w:val="22"/>
-          <w:szCs w:val="22"/>
-        </w:rPr>
-        <w:t xml:space="preserve">One text to the parent, personal, something real about the kid:</w:t>
-      </w:r>
-    </w:p>
-    <w:p>
-      <w:pPr>
-        <w:spacing w:after="120"/>
+        <w:t xml:space="preserve">Parents and old clients</w:t>
+      </w:r>
+    </w:p>
+    <w:p>
+      <w:pPr>
+        <w:spacing w:after="140"/>
+      </w:pPr>
+      <w:r>
+        <w:rPr>
+          <w:rFonts w:ascii="Arial" w:cs="Arial" w:eastAsia="Arial" w:hAnsi="Arial"/>
+          <w:b w:val="false"/>
+          <w:bCs w:val="false"/>
+          <w:sz w:val="22"/>
+          <w:szCs w:val="22"/>
+        </w:rPr>
+        <w:t xml:space="preserve">Text 1:</w:t>
+      </w:r>
+    </w:p>
+    <w:p>
+      <w:pPr>
+        <w:spacing w:after="140"/>
         <w:ind w:left="480"/>
       </w:pPr>
       <w:r>
@@ -274,43 +190,37 @@
     </w:p>
     <w:p>
       <w:pPr>
-        <w:pStyle w:val="ListParagraph"/>
-        <w:numPr>
-          <w:ilvl w:val="0"/>
-          <w:numId w:val="3"/>
-        </w:numPr>
-        <w:spacing w:after="80"/>
-      </w:pPr>
-      <w:r>
-        <w:rPr>
-          <w:rFonts w:ascii="Arial" w:cs="Arial" w:eastAsia="Arial" w:hAnsi="Arial"/>
-          <w:sz w:val="22"/>
-          <w:szCs w:val="22"/>
-        </w:rPr>
-        <w:t xml:space="preserve">On yes, add both. In the group, one line: "[First] is in."</w:t>
-      </w:r>
-    </w:p>
-    <w:p>
-      <w:pPr>
-        <w:pStyle w:val="ListParagraph"/>
-        <w:numPr>
-          <w:ilvl w:val="0"/>
-          <w:numId w:val="3"/>
-        </w:numPr>
-        <w:spacing w:after="80"/>
-      </w:pPr>
-      <w:r>
-        <w:rPr>
-          <w:rFonts w:ascii="Arial" w:cs="Arial" w:eastAsia="Arial" w:hAnsi="Arial"/>
-          <w:sz w:val="22"/>
-          <w:szCs w:val="22"/>
-        </w:rPr>
-        <w:t xml:space="preserve">Within the week, give the parent the first post:</w:t>
-      </w:r>
-    </w:p>
-    <w:p>
-      <w:pPr>
-        <w:spacing w:after="120"/>
+        <w:spacing w:after="140"/>
+      </w:pPr>
+      <w:r>
+        <w:rPr>
+          <w:rFonts w:ascii="Arial" w:cs="Arial" w:eastAsia="Arial" w:hAnsi="Arial"/>
+          <w:b w:val="false"/>
+          <w:bCs w:val="false"/>
+          <w:sz w:val="22"/>
+          <w:szCs w:val="22"/>
+        </w:rPr>
+        <w:t xml:space="preserve">Yes = add both. In the group: "[First] is in."</w:t>
+      </w:r>
+    </w:p>
+    <w:p>
+      <w:pPr>
+        <w:spacing w:after="140"/>
+      </w:pPr>
+      <w:r>
+        <w:rPr>
+          <w:rFonts w:ascii="Arial" w:cs="Arial" w:eastAsia="Arial" w:hAnsi="Arial"/>
+          <w:b w:val="false"/>
+          <w:bCs w:val="false"/>
+          <w:sz w:val="22"/>
+          <w:szCs w:val="22"/>
+        </w:rPr>
+        <w:t xml:space="preserve">Text 2, that week:</w:t>
+      </w:r>
+    </w:p>
+    <w:p>
+      <w:pPr>
+        <w:spacing w:after="140"/>
         <w:ind w:left="480"/>
       </w:pPr>
       <w:r>
@@ -321,32 +231,13 @@
           <w:sz w:val="22"/>
           <w:szCs w:val="22"/>
         </w:rPr>
-        <w:t xml:space="preserve">"Send me one thing [First] did well this week and I'll put it up, or post it yourself, either works."</w:t>
-      </w:r>
-    </w:p>
-    <w:p>
-      <w:pPr>
-        <w:spacing w:after="120"/>
-        <w:rPr>
-          <w:b/>
-          <w:bCs/>
-        </w:rPr>
-      </w:pPr>
-      <w:r>
-        <w:rPr>
-          <w:rFonts w:ascii="Arial" w:cs="Arial" w:eastAsia="Arial" w:hAnsi="Arial"/>
-          <w:b/>
-          <w:bCs/>
-          <w:sz w:val="22"/>
-          <w:szCs w:val="22"/>
-        </w:rPr>
-        <w:t xml:space="preserve">Never a link, never a mass text, never "join my community".</w:t>
+        <w:t xml:space="preserve">"Send me one thing [First] did well this week and I'll put it up."</w:t>
       </w:r>
     </w:p>
     <w:p>
       <w:pPr>
         <w:pStyle w:val="Heading2"/>
-        <w:spacing w:after="100" w:before="280"/>
+        <w:spacing w:after="120" w:before="320"/>
       </w:pPr>
       <w:r>
         <w:rPr>
@@ -356,102 +247,27 @@
           <w:sz w:val="26"/>
           <w:szCs w:val="26"/>
         </w:rPr>
-        <w:t xml:space="preserve">Keeping it alive (only you can do this)</w:t>
-      </w:r>
-    </w:p>
-    <w:p>
-      <w:pPr>
-        <w:pStyle w:val="ListParagraph"/>
-        <w:numPr>
-          <w:ilvl w:val="0"/>
-          <w:numId w:val="4"/>
-        </w:numPr>
-        <w:spacing w:after="80"/>
-      </w:pPr>
-      <w:r>
-        <w:rPr>
-          <w:rFonts w:ascii="Arial" w:cs="Arial" w:eastAsia="Arial" w:hAnsi="Arial"/>
-          <w:sz w:val="22"/>
-          <w:szCs w:val="22"/>
-        </w:rPr>
-        <w:t xml:space="preserve">Every win gets a reply from you within the hour. Short. "That's it."</w:t>
-      </w:r>
-    </w:p>
-    <w:p>
-      <w:pPr>
-        <w:pStyle w:val="ListParagraph"/>
-        <w:numPr>
-          <w:ilvl w:val="0"/>
-          <w:numId w:val="4"/>
-        </w:numPr>
-        <w:spacing w:after="80"/>
-      </w:pPr>
-      <w:r>
-        <w:rPr>
-          <w:rFonts w:ascii="Arial" w:cs="Arial" w:eastAsia="Arial" w:hAnsi="Arial"/>
-          <w:sz w:val="22"/>
-          <w:szCs w:val="22"/>
-        </w:rPr>
-        <w:t xml:space="preserve">First two weeks you seed it: one win or one line every two days.</w:t>
-      </w:r>
-    </w:p>
-    <w:p>
-      <w:pPr>
-        <w:pStyle w:val="ListParagraph"/>
-        <w:numPr>
-          <w:ilvl w:val="0"/>
-          <w:numId w:val="4"/>
-        </w:numPr>
-        <w:spacing w:after="80"/>
-      </w:pPr>
-      <w:r>
-        <w:rPr>
-          <w:rFonts w:ascii="Arial" w:cs="Arial" w:eastAsia="Arial" w:hAnsi="Arial"/>
-          <w:sz w:val="22"/>
-          <w:szCs w:val="22"/>
-        </w:rPr>
-        <w:t xml:space="preserve">Events are announced here first, before Instagram, every time. Make it true and say it.</w:t>
-      </w:r>
-    </w:p>
-    <w:p>
-      <w:pPr>
-        <w:pStyle w:val="ListParagraph"/>
-        <w:numPr>
-          <w:ilvl w:val="0"/>
-          <w:numId w:val="4"/>
-        </w:numPr>
-        <w:spacing w:after="80"/>
-      </w:pPr>
-      <w:r>
-        <w:rPr>
-          <w:rFonts w:ascii="Arial" w:cs="Arial" w:eastAsia="Arial" w:hAnsi="Arial"/>
-          <w:sz w:val="22"/>
-          <w:szCs w:val="22"/>
-        </w:rPr>
-        <w:t xml:space="preserve">Nothing is ever sold in the group. Not once.</w:t>
-      </w:r>
-    </w:p>
-    <w:p>
-      <w:pPr>
-        <w:pStyle w:val="ListParagraph"/>
-        <w:numPr>
-          <w:ilvl w:val="0"/>
-          <w:numId w:val="4"/>
-        </w:numPr>
-        <w:spacing w:after="80"/>
-      </w:pPr>
-      <w:r>
-        <w:rPr>
-          <w:rFonts w:ascii="Arial" w:cs="Arial" w:eastAsia="Arial" w:hAnsi="Arial"/>
-          <w:sz w:val="22"/>
-          <w:szCs w:val="22"/>
-        </w:rPr>
-        <w:t xml:space="preserve">When it goes quiet, pick one player and hand him a post.</w:t>
+        <w:t xml:space="preserve">In the group</w:t>
+      </w:r>
+    </w:p>
+    <w:p>
+      <w:pPr>
+        <w:spacing w:after="140"/>
+      </w:pPr>
+      <w:r>
+        <w:rPr>
+          <w:rFonts w:ascii="Arial" w:cs="Arial" w:eastAsia="Arial" w:hAnsi="Arial"/>
+          <w:b w:val="false"/>
+          <w:bCs w:val="false"/>
+          <w:sz w:val="22"/>
+          <w:szCs w:val="22"/>
+        </w:rPr>
+        <w:t xml:space="preserve">Reply to every win. Events get announced here first. Never sell.</w:t>
       </w:r>
     </w:p>
     <w:sectPr>
       <w:pgSz w:w="12240" w:h="15840" w:orient="portrait"/>
-      <w:pgMar w:top="1200" w:right="1300" w:bottom="1200" w:left="1300" w:header="708" w:footer="708" w:gutter="0"/>
+      <w:pgMar w:top="1300" w:right="1400" w:bottom="1300" w:left="1400" w:header="708" w:footer="708" w:gutter="0"/>
       <w:pgNumType/>
       <w:docGrid w:linePitch="360"/>
     </w:sectPr>
@@ -619,62 +435,8 @@
       </w:pPr>
     </w:lvl>
   </w:abstractNum>
-  <w:abstractNum w:abstractNumId="2" w15:restartNumberingAfterBreak="0">
-    <w:multiLevelType w:val="hybridMultilevel"/>
-    <w:lvl w:ilvl="0" w:tentative="1">
-      <w:start w:val="1"/>
-      <w:numFmt w:val="decimal"/>
-      <w:lvlText w:val="%1."/>
-      <w:lvlJc w:val="left"/>
-      <w:pPr>
-        <w:ind w:left="480" w:hanging="300"/>
-      </w:pPr>
-    </w:lvl>
-  </w:abstractNum>
-  <w:abstractNum w:abstractNumId="3" w15:restartNumberingAfterBreak="0">
-    <w:multiLevelType w:val="hybridMultilevel"/>
-    <w:lvl w:ilvl="0" w:tentative="1">
-      <w:start w:val="1"/>
-      <w:numFmt w:val="decimal"/>
-      <w:lvlText w:val="%1."/>
-      <w:lvlJc w:val="left"/>
-      <w:pPr>
-        <w:ind w:left="480" w:hanging="300"/>
-      </w:pPr>
-    </w:lvl>
-  </w:abstractNum>
-  <w:abstractNum w:abstractNumId="4" w15:restartNumberingAfterBreak="0">
-    <w:multiLevelType w:val="hybridMultilevel"/>
-    <w:lvl w:ilvl="0" w:tentative="1">
-      <w:start w:val="1"/>
-      <w:numFmt w:val="bullet"/>
-      <w:lvlText w:val="•"/>
-      <w:lvlJc w:val="left"/>
-      <w:pPr>
-        <w:ind w:left="480" w:hanging="300"/>
-      </w:pPr>
-    </w:lvl>
-  </w:abstractNum>
   <w:num w:numId="1">
     <w:abstractNumId w:val="1"/>
-    <w:lvlOverride w:ilvl="0">
-      <w:startOverride w:val="1"/>
-    </w:lvlOverride>
-  </w:num>
-  <w:num w:numId="2">
-    <w:abstractNumId w:val="2"/>
-    <w:lvlOverride w:ilvl="0">
-      <w:startOverride w:val="1"/>
-    </w:lvlOverride>
-  </w:num>
-  <w:num w:numId="3">
-    <w:abstractNumId w:val="3"/>
-    <w:lvlOverride w:ilvl="0">
-      <w:startOverride w:val="1"/>
-    </w:lvlOverride>
-  </w:num>
-  <w:num w:numId="4">
-    <w:abstractNumId w:val="4"/>
     <w:lvlOverride w:ilvl="0">
       <w:startOverride w:val="1"/>
     </w:lvlOverride>

</xml_diff>

<commit_message>
Community: playbook, second text goes right after the yes
Co-Authored-By: Claude Fable 5.1 <noreply@anthropic.com>
Claude-Session: https://claude.ai/code/session_011JsCTTjCbUkHbTuWTKQSXJ
</commit_message>
<xml_diff>
--- a/marketing/community/strive-elite-groupme-playbook.docx
+++ b/marketing/community/strive-elite-groupme-playbook.docx
@@ -107,7 +107,7 @@
           <w:sz w:val="22"/>
           <w:szCs w:val="22"/>
         </w:rPr>
-        <w:t xml:space="preserve">Text 2, next day:</w:t>
+        <w:t xml:space="preserve">Text 2, right after he says yes:</w:t>
       </w:r>
     </w:p>
     <w:p>
@@ -215,7 +215,7 @@
           <w:sz w:val="22"/>
           <w:szCs w:val="22"/>
         </w:rPr>
-        <w:t xml:space="preserve">Text 2, that week:</w:t>
+        <w:t xml:space="preserve">Text 2, right after they say yes:</w:t>
       </w:r>
     </w:p>
     <w:p>

</xml_diff>

<commit_message>
Community: playbook uses the join link and the app download line
Co-Authored-By: Claude Fable 5.1 <noreply@anthropic.com>
Claude-Session: https://claude.ai/code/session_011JsCTTjCbUkHbTuWTKQSXJ
</commit_message>
<xml_diff>
--- a/marketing/community/strive-elite-groupme-playbook.docx
+++ b/marketing/community/strive-elite-groupme-playbook.docx
@@ -30,7 +30,22 @@
           <w:sz w:val="22"/>
           <w:szCs w:val="22"/>
         </w:rPr>
-        <w:t xml:space="preserve">No links. Text by name. Three a day.</w:t>
+        <w:t xml:space="preserve">Text by name. Three a day. [name] = the player's first name.</w:t>
+      </w:r>
+    </w:p>
+    <w:p>
+      <w:pPr>
+        <w:spacing w:after="140"/>
+      </w:pPr>
+      <w:r>
+        <w:rPr>
+          <w:rFonts w:ascii="Arial" w:cs="Arial" w:eastAsia="Arial" w:hAnsi="Arial"/>
+          <w:b w:val="false"/>
+          <w:bCs w:val="false"/>
+          <w:sz w:val="22"/>
+          <w:szCs w:val="22"/>
+        </w:rPr>
+        <w:t xml:space="preserve">Link: https://groupme.com/join_group/118204159/WpHP7wRN</w:t>
       </w:r>
     </w:p>
     <w:p>
@@ -77,7 +92,7 @@
           <w:sz w:val="22"/>
           <w:szCs w:val="22"/>
         </w:rPr>
-        <w:t xml:space="preserve">"[First], putting together a small group of the guys from pickup who actually take this seriously. You're on it. Strive Elite. Wins, motivation, events first. Good if I add you?"</w:t>
+        <w:t xml:space="preserve">"[name], putting together a small group of the guys from pickup who actually take this seriously. You're on it. Strive Elite. Wins, motivation, events first. You in?"</w:t>
       </w:r>
     </w:p>
     <w:p>
@@ -92,7 +107,49 @@
           <w:sz w:val="22"/>
           <w:szCs w:val="22"/>
         </w:rPr>
-        <w:t xml:space="preserve">Yes = add him. In the group: "[First] is in."</w:t>
+        <w:t xml:space="preserve">Yes:</w:t>
+      </w:r>
+    </w:p>
+    <w:p>
+      <w:pPr>
+        <w:spacing w:after="140"/>
+        <w:ind w:left="480"/>
+      </w:pPr>
+      <w:r>
+        <w:rPr>
+          <w:rFonts w:ascii="Arial" w:cs="Arial" w:eastAsia="Arial" w:hAnsi="Arial"/>
+          <w:i/>
+          <w:iCs/>
+          <w:sz w:val="22"/>
+          <w:szCs w:val="22"/>
+        </w:rPr>
+        <w:t xml:space="preserve">"Download the GroupMe app real quick and tap this:</w:t>
+      </w:r>
+      <w:r>
+        <w:br/>
+      </w:r>
+      <w:r>
+        <w:rPr>
+          <w:rFonts w:ascii="Arial" w:cs="Arial" w:eastAsia="Arial" w:hAnsi="Arial"/>
+          <w:i/>
+          <w:iCs/>
+          <w:sz w:val="22"/>
+          <w:szCs w:val="22"/>
+        </w:rPr>
+        <w:t xml:space="preserve">https://groupme.com/join_group/118204159/WpHP7wRN</w:t>
+      </w:r>
+      <w:r>
+        <w:br/>
+      </w:r>
+      <w:r>
+        <w:rPr>
+          <w:rFonts w:ascii="Arial" w:cs="Arial" w:eastAsia="Arial" w:hAnsi="Arial"/>
+          <w:i/>
+          <w:iCs/>
+          <w:sz w:val="22"/>
+          <w:szCs w:val="22"/>
+        </w:rPr>
+        <w:t xml:space="preserve">Then post that [goal / move from last pickup] in there."</w:t>
       </w:r>
     </w:p>
     <w:p>
@@ -107,23 +164,7 @@
           <w:sz w:val="22"/>
           <w:szCs w:val="22"/>
         </w:rPr>
-        <w:t xml:space="preserve">Text 2, right after he says yes:</w:t>
-      </w:r>
-    </w:p>
-    <w:p>
-      <w:pPr>
-        <w:spacing w:after="140"/>
-        <w:ind w:left="480"/>
-      </w:pPr>
-      <w:r>
-        <w:rPr>
-          <w:rFonts w:ascii="Arial" w:cs="Arial" w:eastAsia="Arial" w:hAnsi="Arial"/>
-          <w:i/>
-          <w:iCs/>
-          <w:sz w:val="22"/>
-          <w:szCs w:val="22"/>
-        </w:rPr>
-        <w:t xml:space="preserve">"Post that [goal / move from last pickup] in the group."</w:t>
+        <w:t xml:space="preserve">In the group: "[name] is in."</w:t>
       </w:r>
     </w:p>
     <w:p>
@@ -185,7 +226,7 @@
           <w:sz w:val="22"/>
           <w:szCs w:val="22"/>
         </w:rPr>
-        <w:t xml:space="preserve">"Hey [Parent], [First] is one of the players I want around this group. Strive Elite GroupMe, our most ambitious players and their families. Wins, motivation, events first. Good if I add you both?"</w:t>
+        <w:t xml:space="preserve">"Hey [parent], [name] is one of the players I want around this group. Strive Elite GroupMe, our most ambitious players and their families. Wins, motivation, events first. You both in?"</w:t>
       </w:r>
     </w:p>
     <w:p>
@@ -200,7 +241,49 @@
           <w:sz w:val="22"/>
           <w:szCs w:val="22"/>
         </w:rPr>
-        <w:t xml:space="preserve">Yes = add both. In the group: "[First] is in."</w:t>
+        <w:t xml:space="preserve">Yes:</w:t>
+      </w:r>
+    </w:p>
+    <w:p>
+      <w:pPr>
+        <w:spacing w:after="140"/>
+        <w:ind w:left="480"/>
+      </w:pPr>
+      <w:r>
+        <w:rPr>
+          <w:rFonts w:ascii="Arial" w:cs="Arial" w:eastAsia="Arial" w:hAnsi="Arial"/>
+          <w:i/>
+          <w:iCs/>
+          <w:sz w:val="22"/>
+          <w:szCs w:val="22"/>
+        </w:rPr>
+        <w:t xml:space="preserve">"Download the GroupMe app real quick and tap this:</w:t>
+      </w:r>
+      <w:r>
+        <w:br/>
+      </w:r>
+      <w:r>
+        <w:rPr>
+          <w:rFonts w:ascii="Arial" w:cs="Arial" w:eastAsia="Arial" w:hAnsi="Arial"/>
+          <w:i/>
+          <w:iCs/>
+          <w:sz w:val="22"/>
+          <w:szCs w:val="22"/>
+        </w:rPr>
+        <w:t xml:space="preserve">https://groupme.com/join_group/118204159/WpHP7wRN</w:t>
+      </w:r>
+      <w:r>
+        <w:br/>
+      </w:r>
+      <w:r>
+        <w:rPr>
+          <w:rFonts w:ascii="Arial" w:cs="Arial" w:eastAsia="Arial" w:hAnsi="Arial"/>
+          <w:i/>
+          <w:iCs/>
+          <w:sz w:val="22"/>
+          <w:szCs w:val="22"/>
+        </w:rPr>
+        <w:t xml:space="preserve">Send me one thing [name] did well this week and I'll put it up."</w:t>
       </w:r>
     </w:p>
     <w:p>
@@ -215,23 +298,7 @@
           <w:sz w:val="22"/>
           <w:szCs w:val="22"/>
         </w:rPr>
-        <w:t xml:space="preserve">Text 2, right after they say yes:</w:t>
-      </w:r>
-    </w:p>
-    <w:p>
-      <w:pPr>
-        <w:spacing w:after="140"/>
-        <w:ind w:left="480"/>
-      </w:pPr>
-      <w:r>
-        <w:rPr>
-          <w:rFonts w:ascii="Arial" w:cs="Arial" w:eastAsia="Arial" w:hAnsi="Arial"/>
-          <w:i/>
-          <w:iCs/>
-          <w:sz w:val="22"/>
-          <w:szCs w:val="22"/>
-        </w:rPr>
-        <w:t xml:space="preserve">"Send me one thing [First] did well this week and I'll put it up."</w:t>
+        <w:t xml:space="preserve">In the group: "[name] is in."</w:t>
       </w:r>
     </w:p>
     <w:p>

</xml_diff>